<commit_message>
court(moctapped): answering brief latex gated, spaced ellipses as plain spaces now that the model binds them (fb-595.54.75)
Co-Authored-By: Claude Opus 5.5 <noreply@anthropic.com>
</commit_message>
<xml_diff>
--- a/courts/eighth-circuit/missouri/state/court-of-appeals-eastern-district/answering-brief/usage/OUTPUT-answering-brief.docx
+++ b/courts/eighth-circuit/missouri/state/court-of-appeals-eastern-district/answering-brief/usage/OUTPUT-answering-brief.docx
@@ -3326,7 +3326,7 @@
         <w:t xml:space="preserve"> </w:t>
       </w:r>
       <w:r>
-        <w:t xml:space="preserve">(“The supreme court shall have exclusive appellate jurisdiction in all cases involving the validity . . . of a statute or provision of the constitution of this state . . .”) Respondent concedes that Appellant’s constitutional questions are real and substantial in light of the recent amendment</w:t>
+        <w:t xml:space="preserve">(“The supreme court shall have exclusive appellate jurisdiction in all cases involving the validity . . . of a statute or provision of the constitution of this state . . .”) Respondent concedes that Appellant’s constitutional questions are real and substantial in light of the recent amendment</w:t>
       </w:r>
       <w:r>
         <w:rPr>
@@ -3860,7 +3860,7 @@
         <w:pStyle w:val="XdQuoteOnly"/>
       </w:pPr>
       <w:r>
-        <w:t xml:space="preserve">Absent some constitutional imperative . . . it simply is not the role of the court of appeals or this Court to grant relief on arguments that were not presented to or decided by the trial court. This rule abides regardless of the merits of the new argument. ‘Appellate courts are merely courts of review for trial errors, and there can be no review of a matter which has not been presented to or expressly decided by the trial court.’</w:t>
+        <w:t xml:space="preserve">Absent some constitutional imperative . . . it simply is not the role of the court of appeals or this Court to grant relief on arguments that were not presented to or decided by the trial court. This rule abides regardless of the merits of the new argument. ‘Appellate courts are merely courts of review for trial errors, and there can be no review of a matter which has not been presented to or expressly decided by the trial court.’</w:t>
       </w:r>
     </w:p>
     <w:p>
@@ -5300,7 +5300,7 @@
         <w:t xml:space="preserve"> </w:t>
       </w:r>
       <w:r>
-        <w:t xml:space="preserve">(enacted in 2003), which includes in subsection 2(3) a requirement that concealed carry permits only be issued to individuals who have “not pled guilty to or entered a plea of nolo contendere or been convicted of a crime punishable by imprisonment for a term exceeding one year . . .”</w:t>
+        <w:t xml:space="preserve">(enacted in 2003), which includes in subsection 2(3) a requirement that concealed carry permits only be issued to individuals who have “not pled guilty to or entered a plea of nolo contendere or been convicted of a crime punishable by imprisonment for a term exceeding one year . . .”</w:t>
       </w:r>
     </w:p>
     <w:p>
@@ -5667,8 +5667,6 @@
         <w:rPr>
           <w:b/>
           <w:bCs/>
-          <w:i/>
-          <w:iCs/>
         </w:rPr>
         <w:t xml:space="preserve">Guastello</w:t>
       </w:r>
@@ -5885,7 +5883,7 @@
         <w:t xml:space="preserve"> </w:t>
       </w:r>
       <w:r>
-        <w:t xml:space="preserve">RSMo, provides that “no person shall be granted a license . . . who has been convicted . . . of a violation of the provisions of any law applicable to the manufacture or sale of intoxicating liquor.”</w:t>
+        <w:t xml:space="preserve">RSMo, provides that “no person shall be granted a license . . . who has been convicted . . . of a violation of the provisions of any law applicable to the manufacture or sale of intoxicating liquor.”</w:t>
       </w:r>
       <w:r>
         <w:t xml:space="preserve"> </w:t>
@@ -5901,7 +5899,7 @@
         <w:t xml:space="preserve"> </w:t>
       </w:r>
       <w:r>
-        <w:t xml:space="preserve">at 22. As noted earlier, subsection 2(3) of the concealed carry statute includes a requirement that concealed carry permits only be issued to individuals who have “not pled guilty to or entered a plea of nolo contendere or been convicted of a crime punishable by imprisonment for a term exceeding one year . . .” Section 571.101.2(3).</w:t>
+        <w:t xml:space="preserve">at 22. As noted earlier, subsection 2(3) of the concealed carry statute includes a requirement that concealed carry permits only be issued to individuals who have “not pled guilty to or entered a plea of nolo contendere or been convicted of a crime punishable by imprisonment for a term exceeding one year . . .” Section 571.101.2(3).</w:t>
       </w:r>
     </w:p>
     <w:p>
@@ -6612,16 +6610,10 @@
     </w:p>
     <w:p>
       <w:pPr>
-        <w:pStyle w:val="XdTailList1"/>
-      </w:pPr>
-      <w:r>
-        <w:t xml:space="preserve">(636)</w:t>
-      </w:r>
-      <w:r>
-        <w:tab/>
-      </w:r>
-      <w:r>
-        <w:t xml:space="preserve">797</w:t>
+        <w:pStyle w:val="XdTail"/>
+      </w:pPr>
+      <w:r>
+        <w:t xml:space="preserve">(636) 797</w:t>
       </w:r>
       <w:r>
         <w:noBreakHyphen/>
@@ -7517,6 +7509,7 @@
     <w:unhideWhenUsed/>
     <w:qFormat/>
     <w:pPr>
+      <w:keepLines/>
       <w:spacing w:before="0" w:after="140" w:line="299" w:lineRule="exact"/>
     </w:pPr>
     <w:rPr>
@@ -7767,6 +7760,33 @@
     <w:pPr>
       <w:spacing w:before="0" w:after="0" w:line="449" w:lineRule="exact"/>
       <w:ind w:left="2160" w:hanging="720"/>
+    </w:pPr>
+  </w:style>
+  <w:style w:type="paragraph" w:customStyle="1" w:styleId="XdQuoteList1">
+    <w:name w:val="Xd Quote List 1"/>
+    <w:basedOn w:val="Normal"/>
+    <w:qFormat/>
+    <w:pPr>
+      <w:spacing w:before="0" w:after="0" w:line="299" w:lineRule="exact"/>
+      <w:ind w:left="1440" w:right="720" w:hanging="720"/>
+    </w:pPr>
+  </w:style>
+  <w:style w:type="paragraph" w:customStyle="1" w:styleId="XdQuoteList2">
+    <w:name w:val="Xd Quote List 2"/>
+    <w:basedOn w:val="Normal"/>
+    <w:qFormat/>
+    <w:pPr>
+      <w:spacing w:before="0" w:after="0" w:line="299" w:lineRule="exact"/>
+      <w:ind w:left="2160" w:right="720" w:hanging="720"/>
+    </w:pPr>
+  </w:style>
+  <w:style w:type="paragraph" w:customStyle="1" w:styleId="XdQuoteList3">
+    <w:name w:val="Xd Quote List 3"/>
+    <w:basedOn w:val="Normal"/>
+    <w:qFormat/>
+    <w:pPr>
+      <w:spacing w:before="0" w:after="0" w:line="299" w:lineRule="exact"/>
+      <w:ind w:left="2880" w:right="720" w:hanging="720"/>
     </w:pPr>
   </w:style>
   <w:style w:type="paragraph" w:customStyle="1" w:styleId="XdQuoteOnly">

</xml_diff>